<commit_message>
docs(livrables): captures d'écran dans le rapport et le guide
Trois captures actuelles des pages publiques (tableau de bord avec
bandeau héro, assistant IA avec conversation et recommandations,
page Méthodologie) insérées avec liseré et légendes « Figure N ».

Co-Authored-By: Claude Fable 5 <noreply@anthropic.com>
</commit_message>
<xml_diff>
--- a/docs/livrables/PortFlow_Guide_Utilisateur.docx
+++ b/docs/livrables/PortFlow_Guide_Utilisateur.docx
@@ -446,7 +446,7 @@
           <w:sz w:val="36"/>
           <w:szCs w:val="36"/>
         </w:rPr>
-        <w:t>GUIDE DE L’UTILISATEUR — 05/07/2026</w:t>
+        <w:t>GUIDE DE L’UTILISATEUR — 06/07/2026</w:t>
       </w:r>
       <w:r/>
       <w:r>
@@ -2015,6 +2015,68 @@
     </w:p>
     <w:p>
       <w:pPr>
+        <w:spacing w:before="120" w:after="40"/>
+        <w:jc w:val="center"/>
+        <w:pBdr>
+          <w:top w:val="single" w:sz="4" w:space="4" w:color="B9CDDC"/>
+          <w:left w:val="single" w:sz="4" w:space="4" w:color="B9CDDC"/>
+          <w:bottom w:val="single" w:sz="4" w:space="4" w:color="B9CDDC"/>
+          <w:right w:val="single" w:sz="4" w:space="4" w:color="B9CDDC"/>
+        </w:pBdr>
+      </w:pPr>
+      <w:r>
+        <w:drawing>
+          <wp:inline xmlns:a="http://schemas.openxmlformats.org/drawingml/2006/main" xmlns:pic="http://schemas.openxmlformats.org/drawingml/2006/picture">
+            <wp:extent cx="5486400" cy="3086100"/>
+            <wp:docPr id="1827121789" name="Picture 1827121789"/>
+            <wp:cNvGraphicFramePr>
+              <a:graphicFrameLocks noChangeAspect="1"/>
+            </wp:cNvGraphicFramePr>
+            <a:graphic>
+              <a:graphicData uri="http://schemas.openxmlformats.org/drawingml/2006/picture">
+                <pic:pic>
+                  <pic:nvPicPr>
+                    <pic:cNvPr id="0" name="dashboard.png"/>
+                    <pic:cNvPicPr/>
+                  </pic:nvPicPr>
+                  <pic:blipFill>
+                    <a:blip r:embed="rId30"/>
+                    <a:stretch>
+                      <a:fillRect/>
+                    </a:stretch>
+                  </pic:blipFill>
+                  <pic:spPr>
+                    <a:xfrm>
+                      <a:off x="0" y="0"/>
+                      <a:ext cx="5486400" cy="3086100"/>
+                    </a:xfrm>
+                    <a:prstGeom prst="rect"/>
+                  </pic:spPr>
+                </pic:pic>
+              </a:graphicData>
+            </a:graphic>
+          </wp:inline>
+        </w:drawing>
+      </w:r>
+    </w:p>
+    <w:p>
+      <w:pPr>
+        <w:spacing w:after="200"/>
+        <w:jc w:val="center"/>
+      </w:pPr>
+      <w:r>
+        <w:rPr>
+          <w:rFonts w:ascii="Garamond" w:hAnsi="Garamond"/>
+          <w:b w:val="0"/>
+          <w:i/>
+          <w:color w:val="595959"/>
+          <w:sz w:val="20"/>
+        </w:rPr>
+        <w:t>Figure 1 — Le tableau de bord : ① le bandeau et le badge « EN DIRECT », ② les cinq indicateurs, ③ la carte des axes et tronçons, ④ le panneau des alertes et de l’état des axes. Le bouton ☰ en haut à gauche ouvre le menu.</w:t>
+      </w:r>
+    </w:p>
+    <w:p>
+      <w:pPr>
         <w:pStyle w:val="Titre2"/>
         <w:spacing w:before="280" w:after="160"/>
       </w:pPr>
@@ -2608,6 +2670,68 @@
     </w:p>
     <w:p>
       <w:pPr>
+        <w:spacing w:before="120" w:after="40"/>
+        <w:jc w:val="center"/>
+        <w:pBdr>
+          <w:top w:val="single" w:sz="4" w:space="4" w:color="B9CDDC"/>
+          <w:left w:val="single" w:sz="4" w:space="4" w:color="B9CDDC"/>
+          <w:bottom w:val="single" w:sz="4" w:space="4" w:color="B9CDDC"/>
+          <w:right w:val="single" w:sz="4" w:space="4" w:color="B9CDDC"/>
+        </w:pBdr>
+      </w:pPr>
+      <w:r>
+        <w:drawing>
+          <wp:inline xmlns:a="http://schemas.openxmlformats.org/drawingml/2006/main" xmlns:pic="http://schemas.openxmlformats.org/drawingml/2006/picture">
+            <wp:extent cx="5486400" cy="3086100"/>
+            <wp:docPr id="1827121790" name="Picture 1827121790"/>
+            <wp:cNvGraphicFramePr>
+              <a:graphicFrameLocks noChangeAspect="1"/>
+            </wp:cNvGraphicFramePr>
+            <a:graphic>
+              <a:graphicData uri="http://schemas.openxmlformats.org/drawingml/2006/picture">
+                <pic:pic>
+                  <pic:nvPicPr>
+                    <pic:cNvPr id="0" name="ia.png"/>
+                    <pic:cNvPicPr/>
+                  </pic:nvPicPr>
+                  <pic:blipFill>
+                    <a:blip r:embed="rId31"/>
+                    <a:stretch>
+                      <a:fillRect/>
+                    </a:stretch>
+                  </pic:blipFill>
+                  <pic:spPr>
+                    <a:xfrm>
+                      <a:off x="0" y="0"/>
+                      <a:ext cx="5486400" cy="3086100"/>
+                    </a:xfrm>
+                    <a:prstGeom prst="rect"/>
+                  </pic:spPr>
+                </pic:pic>
+              </a:graphicData>
+            </a:graphic>
+          </wp:inline>
+        </w:drawing>
+      </w:r>
+    </w:p>
+    <w:p>
+      <w:pPr>
+        <w:spacing w:after="200"/>
+        <w:jc w:val="center"/>
+      </w:pPr>
+      <w:r>
+        <w:rPr>
+          <w:rFonts w:ascii="Garamond" w:hAnsi="Garamond"/>
+          <w:b w:val="0"/>
+          <w:i/>
+          <w:color w:val="595959"/>
+          <w:sz w:val="20"/>
+        </w:rPr>
+        <w:t>Figure 2 — La page IA FlowPort : le panneau de recommandations automatiques, les suggestions cliquables, et un exemple de réponse chiffrée à la question « Quel axe emprunter pour rejoindre le port rapidement ? ».</w:t>
+      </w:r>
+    </w:p>
+    <w:p>
+      <w:pPr>
         <w:pStyle w:val="Titre1"/>
         <w:spacing w:before="360" w:after="200"/>
       </w:pPr>
@@ -2631,6 +2755,68 @@
           <w:sz w:val="24"/>
         </w:rPr>
         <w:t>Accessible à tous en bas de la navigation, elle explique d'où viennent les données, comment sont calculés les niveaux, les références, les prévisions et les alertes — et documente honnêtement les limites du système. C'est la référence à partager avec toute personne qui découvre FlowPort.</w:t>
+      </w:r>
+    </w:p>
+    <w:p>
+      <w:pPr>
+        <w:spacing w:before="120" w:after="40"/>
+        <w:jc w:val="center"/>
+        <w:pBdr>
+          <w:top w:val="single" w:sz="4" w:space="4" w:color="B9CDDC"/>
+          <w:left w:val="single" w:sz="4" w:space="4" w:color="B9CDDC"/>
+          <w:bottom w:val="single" w:sz="4" w:space="4" w:color="B9CDDC"/>
+          <w:right w:val="single" w:sz="4" w:space="4" w:color="B9CDDC"/>
+        </w:pBdr>
+      </w:pPr>
+      <w:r>
+        <w:drawing>
+          <wp:inline xmlns:a="http://schemas.openxmlformats.org/drawingml/2006/main" xmlns:pic="http://schemas.openxmlformats.org/drawingml/2006/picture">
+            <wp:extent cx="5486400" cy="3086100"/>
+            <wp:docPr id="1827121791" name="Picture 1827121791"/>
+            <wp:cNvGraphicFramePr>
+              <a:graphicFrameLocks noChangeAspect="1"/>
+            </wp:cNvGraphicFramePr>
+            <a:graphic>
+              <a:graphicData uri="http://schemas.openxmlformats.org/drawingml/2006/picture">
+                <pic:pic>
+                  <pic:nvPicPr>
+                    <pic:cNvPr id="0" name="methodologie.png"/>
+                    <pic:cNvPicPr/>
+                  </pic:nvPicPr>
+                  <pic:blipFill>
+                    <a:blip r:embed="rId32"/>
+                    <a:stretch>
+                      <a:fillRect/>
+                    </a:stretch>
+                  </pic:blipFill>
+                  <pic:spPr>
+                    <a:xfrm>
+                      <a:off x="0" y="0"/>
+                      <a:ext cx="5486400" cy="3086100"/>
+                    </a:xfrm>
+                    <a:prstGeom prst="rect"/>
+                  </pic:spPr>
+                </pic:pic>
+              </a:graphicData>
+            </a:graphic>
+          </wp:inline>
+        </w:drawing>
+      </w:r>
+    </w:p>
+    <w:p>
+      <w:pPr>
+        <w:spacing w:after="200"/>
+        <w:jc w:val="center"/>
+      </w:pPr>
+      <w:r>
+        <w:rPr>
+          <w:rFonts w:ascii="Garamond" w:hAnsi="Garamond"/>
+          <w:b w:val="0"/>
+          <w:i/>
+          <w:color w:val="595959"/>
+          <w:sz w:val="20"/>
+        </w:rPr>
+        <w:t>Figure 3 — La page Méthodologie : dispositif de mesure, tableau des axes surveillés et grille des niveaux N1→N5 avec leur lecture opérationnelle.</w:t>
       </w:r>
     </w:p>
     <w:p>
@@ -3835,7 +4021,7 @@
           <w:color w:val="595959"/>
           <w:sz w:val="20"/>
         </w:rPr>
-        <w:t>FlowPort — Port Autonome d'Abidjan · guide de l'utilisateur · 05/07/2026</w:t>
+        <w:t>FlowPort — Port Autonome d'Abidjan · guide de l'utilisateur · 06/07/2026</w:t>
       </w:r>
     </w:p>
     <w:sectPr>

</xml_diff>